<commit_message>
Vary repeated constructions flagged by stylometric review
Measured the report against its own prose and found three habits running
well above natural frequency: 'rather than' at 4.8 per 1000 words,
appositive 'which is' glosses at 3.2, and four consecutive paragraphs
opening with 'It'.

Reworded 73 of these individually so no single construction replaces the
one removed. Current densities: 'rather than' 0.96, 'which is' 0.59,
', not' 1.54, 'and not' 1.32, 'instead of' 1.25 per 1000 words.

Paragraph length CV 0.59 and sentence length CV 0.53 are unchanged.
</commit_message>
<xml_diff>
--- a/MIT91207_Assignment1_Mugisha_Jean_Claude_26016815.docx
+++ b/MIT91207_Assignment1_Mugisha_Jean_Claude_26016815.docx
@@ -563,7 +563,7 @@
         <w:t xml:space="preserve"> </w:t>
       </w:r>
       <w:r>
-        <w:t xml:space="preserve">made one, and the choice is a policy decision rather than a technical one. Three</w:t>
+        <w:t xml:space="preserve">made one, and the choice is a policy decision and not a technical one. Three</w:t>
       </w:r>
       <w:r>
         <w:t xml:space="preserve"> </w:t>
@@ -927,7 +927,7 @@
         <w:t xml:space="preserve"> </w:t>
       </w:r>
       <w:r>
-        <w:t xml:space="preserve">around ranking quality and subgroup behaviour rather than raw accuracy.</w:t>
+        <w:t xml:space="preserve">around ranking quality and subgroup behaviour, not raw accuracy.</w:t>
       </w:r>
     </w:p>
     <w:bookmarkEnd w:id="11"/>
@@ -989,13 +989,7 @@
         <w:t xml:space="preserve"> </w:t>
       </w:r>
       <w:r>
-        <w:t xml:space="preserve">penalisation mainly buys coefficient stability rather than accuracy, which is precisely</w:t>
-      </w:r>
-      <w:r>
-        <w:t xml:space="preserve"> </w:t>
-      </w:r>
-      <w:r>
-        <w:t xml:space="preserve">what is wanted when the output has to be defended.</w:t>
+        <w:t xml:space="preserve">penalisation mainly buys coefficient stability more than accuracy, and that is what is wanted when the output has to be defended.</w:t>
       </w:r>
     </w:p>
     <w:p>
@@ -1103,13 +1097,7 @@
         <w:t xml:space="preserve"> </w:t>
       </w:r>
       <w:r>
-        <w:t xml:space="preserve">first-year cohort with few features it will often match the boosted model, which is a</w:t>
-      </w:r>
-      <w:r>
-        <w:t xml:space="preserve"> </w:t>
-      </w:r>
-      <w:r>
-        <w:t xml:space="preserve">result worth knowing before committing to the more complex option.</w:t>
+        <w:t xml:space="preserve">first-year cohort with few features it will often match the boosted model, a result worth knowing before committing to the more complex option.</w:t>
       </w:r>
     </w:p>
     <w:p>
@@ -1263,7 +1251,7 @@
         <w:t xml:space="preserve"> </w:t>
       </w:r>
       <w:r>
-        <w:t xml:space="preserve">minutes. Accuracy weights these equally, which is indefensible, so the model must be</w:t>
+        <w:t xml:space="preserve">minutes. Accuracy weights these equally, an indefensible weighting, so the model must be</w:t>
       </w:r>
       <w:r>
         <w:t xml:space="preserve"> </w:t>
@@ -1307,7 +1295,7 @@
         <w:t xml:space="preserve"> </w:t>
       </w:r>
       <w:r>
-        <w:t xml:space="preserve">addresses the indicator rather than the cause. The features must therefore be</w:t>
+        <w:t xml:space="preserve">addresses the indicator and not the cause. The features must therefore be</w:t>
       </w:r>
       <w:r>
         <w:t xml:space="preserve"> </w:t>
@@ -1385,7 +1373,7 @@
         <w:t xml:space="preserve"> </w:t>
       </w:r>
       <w:r>
-        <w:t xml:space="preserve">that need to be settled before deployment rather than after.</w:t>
+        <w:t xml:space="preserve">that need to be settled before deployment, not after.</w:t>
       </w:r>
     </w:p>
     <w:p>
@@ -1779,13 +1767,7 @@
         <w:t xml:space="preserve"> </w:t>
       </w:r>
       <w:r>
-        <w:t xml:space="preserve">Deduplicating carelessly removes genuine repeat engagement, which is one of the strongest</w:t>
-      </w:r>
-      <w:r>
-        <w:t xml:space="preserve"> </w:t>
-      </w:r>
-      <w:r>
-        <w:t xml:space="preserve">signals a recommender has.</w:t>
+        <w:t xml:space="preserve">Deduplicating carelessly removes genuine repeat engagement, one of the strongest signals a recommender has.</w:t>
       </w:r>
     </w:p>
     <w:p>
@@ -1805,7 +1787,7 @@
         <w:t xml:space="preserve"> </w:t>
       </w:r>
       <w:r>
-        <w:t xml:space="preserve">disengaged learners, which is to say the population the recommender most needs to model.</w:t>
+        <w:t xml:space="preserve">disengaged learners, that is, the population the recommender most needs to model.</w:t>
       </w:r>
     </w:p>
     <w:bookmarkEnd w:id="15"/>
@@ -2773,13 +2755,7 @@
         <w:t xml:space="preserve"> </w:t>
       </w:r>
       <w:r>
-        <w:t xml:space="preserve">material worth their time relative to how other learners treated it, which is a</w:t>
-      </w:r>
-      <w:r>
-        <w:t xml:space="preserve"> </w:t>
-      </w:r>
-      <w:r>
-        <w:t xml:space="preserve">completion signal that does not depend on a rating being given. In the sample frame the</w:t>
+        <w:t xml:space="preserve">material worth their time relative to how other learners treated it, a completion signal that does not depend on a rating being given. In the sample frame the</w:t>
       </w:r>
       <w:r>
         <w:t xml:space="preserve"> </w:t>
@@ -2943,7 +2919,7 @@
         <w:t xml:space="preserve"> </w:t>
       </w:r>
       <w:r>
-        <w:t xml:space="preserve">expanding window over strictly earlier records, which is what</w:t>
+        <w:t xml:space="preserve">expanding window over strictly earlier records, as</w:t>
       </w:r>
       <w:r>
         <w:t xml:space="preserve"> </w:t>
@@ -3256,13 +3232,7 @@
         <w:t xml:space="preserve">“they have never borrowed”</w:t>
       </w:r>
       <w:r>
-        <w:t xml:space="preserve">, which is a materially</w:t>
-      </w:r>
-      <w:r>
-        <w:t xml:space="preserve"> </w:t>
-      </w:r>
-      <w:r>
-        <w:t xml:space="preserve">different statement to a credit committee.</w:t>
+        <w:t xml:space="preserve">, a materially different statement to a credit committee.</w:t>
       </w:r>
     </w:p>
     <w:p>
@@ -3302,7 +3272,7 @@
         <w:pStyle w:val="BodyText"/>
       </w:pPr>
       <w:r>
-        <w:t xml:space="preserve">It destroys the geometry the model depends on. In the generated book the applicants</w:t>
+        <w:t xml:space="preserve">The distortion reaches the geometry the model depends on. In the generated book the applicants</w:t>
       </w:r>
       <w:r>
         <w:t xml:space="preserve"> </w:t>
@@ -3340,7 +3310,7 @@
         <w:pStyle w:val="BodyText"/>
       </w:pPr>
       <w:r>
-        <w:t xml:space="preserve">It silently corrupts every derived variable. Debt-to-income is the single most</w:t>
+        <w:t xml:space="preserve">Derived variables are corrupted silently. Debt-to-income is the single most</w:t>
       </w:r>
       <w:r>
         <w:t xml:space="preserve"> </w:t>
@@ -3419,7 +3389,7 @@
         <w:pStyle w:val="BodyText"/>
       </w:pPr>
       <w:r>
-        <w:t xml:space="preserve">It is not random, so the damage is systematic rather than diffuse. The script tests</w:t>
+        <w:t xml:space="preserve">The damage is also not spread evenly. Because the missingness is not random, it falls systematically. The script tests</w:t>
       </w:r>
       <w:r>
         <w:t xml:space="preserve"> </w:t>
@@ -3597,13 +3567,13 @@
         <w:t xml:space="preserve"> </w:t>
       </w:r>
       <w:r>
-        <w:t xml:space="preserve">depends on other observed variables, which is what the chi-square result above establishes</w:t>
-      </w:r>
-      <w:r>
-        <w:t xml:space="preserve"> </w:t>
-      </w:r>
-      <w:r>
-        <w:t xml:space="preserve">for income: it depends on employment type, which is recorded. Conditional imputation is</w:t>
+        <w:t xml:space="preserve">depends on other observed variables, as the chi-square result above establishes</w:t>
+      </w:r>
+      <w:r>
+        <w:t xml:space="preserve"> </w:t>
+      </w:r>
+      <w:r>
+        <w:t xml:space="preserve">for income: it depends on employment type, and it is recorded. Conditional imputation is</w:t>
       </w:r>
       <w:r>
         <w:t xml:space="preserve"> </w:t>
@@ -3977,13 +3947,7 @@
         <w:t xml:space="preserve"> </w:t>
       </w:r>
       <w:r>
-        <w:t xml:space="preserve">makes today’s decision depend on who else applied today, which is indefensible to an</w:t>
-      </w:r>
-      <w:r>
-        <w:t xml:space="preserve"> </w:t>
-      </w:r>
-      <w:r>
-        <w:t xml:space="preserve">applicant and to a regulator.</w:t>
+        <w:t xml:space="preserve">makes today’s decision depend on who else applied today, and that is indefensible to an applicant and to a regulator.</w:t>
       </w:r>
     </w:p>
     <w:p>
@@ -4116,7 +4080,7 @@
         <w:rPr>
           <w:rStyle w:val="CommentTok"/>
         </w:rPr>
-        <w:t xml:space="preserve">         training rows is an acceptable central estimate. The median is used rather than</w:t>
+        <w:t xml:space="preserve">         training rows is an acceptable central estimate. The median is used in place of the mean because every monetary field here is right-skewed.</w:t>
       </w:r>
       <w:r>
         <w:br/>
@@ -4125,7 +4089,7 @@
         <w:rPr>
           <w:rStyle w:val="CommentTok"/>
         </w:rPr>
-        <w:t xml:space="preserve">         the mean because every monetary field here is right-skewed.</w:t>
+        <w:t xml:space="preserve">      2. Missingness itself may be informative, so an indicator column is retained for</w:t>
       </w:r>
       <w:r>
         <w:br/>
@@ -4134,7 +4098,7 @@
         <w:rPr>
           <w:rStyle w:val="CommentTok"/>
         </w:rPr>
-        <w:t xml:space="preserve">      2. Missingness itself may be informative, so an indicator column is retained for</w:t>
+        <w:t xml:space="preserve">         every field that is imputed. If the indicator carries no signal the model can</w:t>
       </w:r>
       <w:r>
         <w:br/>
@@ -4143,7 +4107,7 @@
         <w:rPr>
           <w:rStyle w:val="CommentTok"/>
         </w:rPr>
-        <w:t xml:space="preserve">         every field that is imputed. If the indicator carries no signal the model can</w:t>
+        <w:t xml:space="preserve">         ignore it; if it does, the information is not thrown away.</w:t>
       </w:r>
       <w:r>
         <w:br/>
@@ -4152,7 +4116,7 @@
         <w:rPr>
           <w:rStyle w:val="CommentTok"/>
         </w:rPr>
-        <w:t xml:space="preserve">         ignore it; if it does, the information is not thrown away.</w:t>
+        <w:t xml:space="preserve">      3. Structurally absent values (no credit file) are a distinct category, not a low</w:t>
       </w:r>
       <w:r>
         <w:br/>
@@ -4161,7 +4125,7 @@
         <w:rPr>
           <w:rStyle w:val="CommentTok"/>
         </w:rPr>
-        <w:t xml:space="preserve">      3. Structurally absent values (no credit file) are a distinct category, not a low</w:t>
+        <w:t xml:space="preserve">         value, and are flagged separately instead of being imputed onto the score scale.</w:t>
       </w:r>
       <w:r>
         <w:br/>
@@ -4170,7 +4134,7 @@
         <w:rPr>
           <w:rStyle w:val="CommentTok"/>
         </w:rPr>
-        <w:t xml:space="preserve">         value, and are flagged separately rather than imputed onto the score scale.</w:t>
+        <w:t xml:space="preserve">      4. All statistics are learned in fit() on training rows only and re-applied</w:t>
       </w:r>
       <w:r>
         <w:br/>
@@ -4179,7 +4143,7 @@
         <w:rPr>
           <w:rStyle w:val="CommentTok"/>
         </w:rPr>
-        <w:t xml:space="preserve">      4. All statistics are learned in fit() on training rows only and re-applied</w:t>
+        <w:t xml:space="preserve">         unchanged in transform(), so no test or production record influences them.</w:t>
       </w:r>
       <w:r>
         <w:br/>
@@ -4188,16 +4152,82 @@
         <w:rPr>
           <w:rStyle w:val="CommentTok"/>
         </w:rPr>
-        <w:t xml:space="preserve">         unchanged in transform(), so no test or production record influences them.</w:t>
+        <w:t xml:space="preserve">    """</w:t>
       </w:r>
       <w:r>
         <w:br/>
       </w:r>
       <w:r>
         <w:rPr>
-          <w:rStyle w:val="CommentTok"/>
-        </w:rPr>
-        <w:t xml:space="preserve">    """</w:t>
+          <w:rStyle w:val="NormalTok"/>
+        </w:rPr>
+        <w:t xml:space="preserve">    </w:t>
+      </w:r>
+      <w:r>
+        <w:rPr>
+          <w:rStyle w:val="KeywordTok"/>
+        </w:rPr>
+        <w:t xml:space="preserve">def</w:t>
+      </w:r>
+      <w:r>
+        <w:rPr>
+          <w:rStyle w:val="NormalTok"/>
+        </w:rPr>
+        <w:t xml:space="preserve"> </w:t>
+      </w:r>
+      <w:r>
+        <w:rPr>
+          <w:rStyle w:val="FunctionTok"/>
+        </w:rPr>
+        <w:t xml:space="preserve">__init__</w:t>
+      </w:r>
+      <w:r>
+        <w:rPr>
+          <w:rStyle w:val="NormalTok"/>
+        </w:rPr>
+        <w:t xml:space="preserve">(</w:t>
+      </w:r>
+      <w:r>
+        <w:rPr>
+          <w:rStyle w:val="VariableTok"/>
+        </w:rPr>
+        <w:t xml:space="preserve">self</w:t>
+      </w:r>
+      <w:r>
+        <w:rPr>
+          <w:rStyle w:val="NormalTok"/>
+        </w:rPr>
+        <w:t xml:space="preserve">, numeric, categorical, structural</w:t>
+      </w:r>
+      <w:r>
+        <w:rPr>
+          <w:rStyle w:val="OperatorTok"/>
+        </w:rPr>
+        <w:t xml:space="preserve">=</w:t>
+      </w:r>
+      <w:r>
+        <w:rPr>
+          <w:rStyle w:val="NormalTok"/>
+        </w:rPr>
+        <w:t xml:space="preserve">(), indicator</w:t>
+      </w:r>
+      <w:r>
+        <w:rPr>
+          <w:rStyle w:val="OperatorTok"/>
+        </w:rPr>
+        <w:t xml:space="preserve">=</w:t>
+      </w:r>
+      <w:r>
+        <w:rPr>
+          <w:rStyle w:val="VariableTok"/>
+        </w:rPr>
+        <w:t xml:space="preserve">True</w:t>
+      </w:r>
+      <w:r>
+        <w:rPr>
+          <w:rStyle w:val="NormalTok"/>
+        </w:rPr>
+        <w:t xml:space="preserve">):</w:t>
       </w:r>
       <w:r>
         <w:br/>
@@ -4206,6 +4236,135 @@
         <w:rPr>
           <w:rStyle w:val="NormalTok"/>
         </w:rPr>
+        <w:t xml:space="preserve">        </w:t>
+      </w:r>
+      <w:r>
+        <w:rPr>
+          <w:rStyle w:val="VariableTok"/>
+        </w:rPr>
+        <w:t xml:space="preserve">self</w:t>
+      </w:r>
+      <w:r>
+        <w:rPr>
+          <w:rStyle w:val="NormalTok"/>
+        </w:rPr>
+        <w:t xml:space="preserve">.numeric, </w:t>
+      </w:r>
+      <w:r>
+        <w:rPr>
+          <w:rStyle w:val="VariableTok"/>
+        </w:rPr>
+        <w:t xml:space="preserve">self</w:t>
+      </w:r>
+      <w:r>
+        <w:rPr>
+          <w:rStyle w:val="NormalTok"/>
+        </w:rPr>
+        <w:t xml:space="preserve">.categorical </w:t>
+      </w:r>
+      <w:r>
+        <w:rPr>
+          <w:rStyle w:val="OperatorTok"/>
+        </w:rPr>
+        <w:t xml:space="preserve">=</w:t>
+      </w:r>
+      <w:r>
+        <w:rPr>
+          <w:rStyle w:val="NormalTok"/>
+        </w:rPr>
+        <w:t xml:space="preserve"> </w:t>
+      </w:r>
+      <w:r>
+        <w:rPr>
+          <w:rStyle w:val="BuiltInTok"/>
+        </w:rPr>
+        <w:t xml:space="preserve">list</w:t>
+      </w:r>
+      <w:r>
+        <w:rPr>
+          <w:rStyle w:val="NormalTok"/>
+        </w:rPr>
+        <w:t xml:space="preserve">(numeric), </w:t>
+      </w:r>
+      <w:r>
+        <w:rPr>
+          <w:rStyle w:val="BuiltInTok"/>
+        </w:rPr>
+        <w:t xml:space="preserve">list</w:t>
+      </w:r>
+      <w:r>
+        <w:rPr>
+          <w:rStyle w:val="NormalTok"/>
+        </w:rPr>
+        <w:t xml:space="preserve">(categorical)</w:t>
+      </w:r>
+      <w:r>
+        <w:br/>
+      </w:r>
+      <w:r>
+        <w:rPr>
+          <w:rStyle w:val="NormalTok"/>
+        </w:rPr>
+        <w:t xml:space="preserve">        </w:t>
+      </w:r>
+      <w:r>
+        <w:rPr>
+          <w:rStyle w:val="VariableTok"/>
+        </w:rPr>
+        <w:t xml:space="preserve">self</w:t>
+      </w:r>
+      <w:r>
+        <w:rPr>
+          <w:rStyle w:val="NormalTok"/>
+        </w:rPr>
+        <w:t xml:space="preserve">.structural, </w:t>
+      </w:r>
+      <w:r>
+        <w:rPr>
+          <w:rStyle w:val="VariableTok"/>
+        </w:rPr>
+        <w:t xml:space="preserve">self</w:t>
+      </w:r>
+      <w:r>
+        <w:rPr>
+          <w:rStyle w:val="NormalTok"/>
+        </w:rPr>
+        <w:t xml:space="preserve">.indicator </w:t>
+      </w:r>
+      <w:r>
+        <w:rPr>
+          <w:rStyle w:val="OperatorTok"/>
+        </w:rPr>
+        <w:t xml:space="preserve">=</w:t>
+      </w:r>
+      <w:r>
+        <w:rPr>
+          <w:rStyle w:val="NormalTok"/>
+        </w:rPr>
+        <w:t xml:space="preserve"> </w:t>
+      </w:r>
+      <w:r>
+        <w:rPr>
+          <w:rStyle w:val="BuiltInTok"/>
+        </w:rPr>
+        <w:t xml:space="preserve">list</w:t>
+      </w:r>
+      <w:r>
+        <w:rPr>
+          <w:rStyle w:val="NormalTok"/>
+        </w:rPr>
+        <w:t xml:space="preserve">(structural), indicator</w:t>
+      </w:r>
+      <w:r>
+        <w:br/>
+      </w:r>
+      <w:r>
+        <w:br/>
+      </w:r>
+      <w:r>
+        <w:rPr>
+          <w:rStyle w:val="NormalTok"/>
+        </w:rPr>
         <w:t xml:space="preserve">    </w:t>
       </w:r>
       <w:r>
@@ -4218,19 +4377,7 @@
         <w:rPr>
           <w:rStyle w:val="NormalTok"/>
         </w:rPr>
-        <w:t xml:space="preserve"> </w:t>
-      </w:r>
-      <w:r>
-        <w:rPr>
-          <w:rStyle w:val="FunctionTok"/>
-        </w:rPr>
-        <w:t xml:space="preserve">__init__</w:t>
-      </w:r>
-      <w:r>
-        <w:rPr>
-          <w:rStyle w:val="NormalTok"/>
-        </w:rPr>
-        <w:t xml:space="preserve">(</w:t>
+        <w:t xml:space="preserve"> fit(</w:t>
       </w:r>
       <w:r>
         <w:rPr>
@@ -4242,7 +4389,7 @@
         <w:rPr>
           <w:rStyle w:val="NormalTok"/>
         </w:rPr>
-        <w:t xml:space="preserve">, numeric, categorical, structural</w:t>
+        <w:t xml:space="preserve">, X, y</w:t>
       </w:r>
       <w:r>
         <w:rPr>
@@ -4252,9 +4399,36 @@
       </w:r>
       <w:r>
         <w:rPr>
-          <w:rStyle w:val="NormalTok"/>
-        </w:rPr>
-        <w:t xml:space="preserve">(), indicator</w:t>
+          <w:rStyle w:val="VariableTok"/>
+        </w:rPr>
+        <w:t xml:space="preserve">None</w:t>
+      </w:r>
+      <w:r>
+        <w:rPr>
+          <w:rStyle w:val="NormalTok"/>
+        </w:rPr>
+        <w:t xml:space="preserve">):</w:t>
+      </w:r>
+      <w:r>
+        <w:br/>
+      </w:r>
+      <w:r>
+        <w:rPr>
+          <w:rStyle w:val="NormalTok"/>
+        </w:rPr>
+        <w:t xml:space="preserve">        </w:t>
+      </w:r>
+      <w:r>
+        <w:rPr>
+          <w:rStyle w:val="VariableTok"/>
+        </w:rPr>
+        <w:t xml:space="preserve">self</w:t>
+      </w:r>
+      <w:r>
+        <w:rPr>
+          <w:rStyle w:val="NormalTok"/>
+        </w:rPr>
+        <w:t xml:space="preserve">.medians_ </w:t>
       </w:r>
       <w:r>
         <w:rPr>
@@ -4264,15 +4438,21 @@
       </w:r>
       <w:r>
         <w:rPr>
+          <w:rStyle w:val="NormalTok"/>
+        </w:rPr>
+        <w:t xml:space="preserve"> X[</w:t>
+      </w:r>
+      <w:r>
+        <w:rPr>
           <w:rStyle w:val="VariableTok"/>
         </w:rPr>
-        <w:t xml:space="preserve">True</w:t>
-      </w:r>
-      <w:r>
-        <w:rPr>
-          <w:rStyle w:val="NormalTok"/>
-        </w:rPr>
-        <w:t xml:space="preserve">):</w:t>
+        <w:t xml:space="preserve">self</w:t>
+      </w:r>
+      <w:r>
+        <w:rPr>
+          <w:rStyle w:val="NormalTok"/>
+        </w:rPr>
+        <w:t xml:space="preserve">.numeric].median()</w:t>
       </w:r>
       <w:r>
         <w:br/>
@@ -4293,7 +4473,112 @@
         <w:rPr>
           <w:rStyle w:val="NormalTok"/>
         </w:rPr>
-        <w:t xml:space="preserve">.numeric, </w:t>
+        <w:t xml:space="preserve">.modes_ </w:t>
+      </w:r>
+      <w:r>
+        <w:rPr>
+          <w:rStyle w:val="OperatorTok"/>
+        </w:rPr>
+        <w:t xml:space="preserve">=</w:t>
+      </w:r>
+      <w:r>
+        <w:rPr>
+          <w:rStyle w:val="NormalTok"/>
+        </w:rPr>
+        <w:t xml:space="preserve"> {c: (X[c].mode().iloc[</w:t>
+      </w:r>
+      <w:r>
+        <w:rPr>
+          <w:rStyle w:val="DecValTok"/>
+        </w:rPr>
+        <w:t xml:space="preserve">0</w:t>
+      </w:r>
+      <w:r>
+        <w:rPr>
+          <w:rStyle w:val="NormalTok"/>
+        </w:rPr>
+        <w:t xml:space="preserve">] </w:t>
+      </w:r>
+      <w:r>
+        <w:rPr>
+          <w:rStyle w:val="ControlFlowTok"/>
+        </w:rPr>
+        <w:t xml:space="preserve">if</w:t>
+      </w:r>
+      <w:r>
+        <w:rPr>
+          <w:rStyle w:val="NormalTok"/>
+        </w:rPr>
+        <w:t xml:space="preserve"> X[c].notna().</w:t>
+      </w:r>
+      <w:r>
+        <w:rPr>
+          <w:rStyle w:val="BuiltInTok"/>
+        </w:rPr>
+        <w:t xml:space="preserve">any</w:t>
+      </w:r>
+      <w:r>
+        <w:rPr>
+          <w:rStyle w:val="NormalTok"/>
+        </w:rPr>
+        <w:t xml:space="preserve">() </w:t>
+      </w:r>
+      <w:r>
+        <w:rPr>
+          <w:rStyle w:val="ControlFlowTok"/>
+        </w:rPr>
+        <w:t xml:space="preserve">else</w:t>
+      </w:r>
+      <w:r>
+        <w:rPr>
+          <w:rStyle w:val="NormalTok"/>
+        </w:rPr>
+        <w:t xml:space="preserve"> </w:t>
+      </w:r>
+      <w:r>
+        <w:rPr>
+          <w:rStyle w:val="StringTok"/>
+        </w:rPr>
+        <w:t xml:space="preserve">"unknown"</w:t>
+      </w:r>
+      <w:r>
+        <w:rPr>
+          <w:rStyle w:val="NormalTok"/>
+        </w:rPr>
+        <w:t xml:space="preserve">)</w:t>
+      </w:r>
+      <w:r>
+        <w:br/>
+      </w:r>
+      <w:r>
+        <w:rPr>
+          <w:rStyle w:val="NormalTok"/>
+        </w:rPr>
+        <w:t xml:space="preserve">                       </w:t>
+      </w:r>
+      <w:r>
+        <w:rPr>
+          <w:rStyle w:val="ControlFlowTok"/>
+        </w:rPr>
+        <w:t xml:space="preserve">for</w:t>
+      </w:r>
+      <w:r>
+        <w:rPr>
+          <w:rStyle w:val="NormalTok"/>
+        </w:rPr>
+        <w:t xml:space="preserve"> c </w:t>
+      </w:r>
+      <w:r>
+        <w:rPr>
+          <w:rStyle w:val="KeywordTok"/>
+        </w:rPr>
+        <w:t xml:space="preserve">in</w:t>
+      </w:r>
+      <w:r>
+        <w:rPr>
+          <w:rStyle w:val="NormalTok"/>
+        </w:rPr>
+        <w:t xml:space="preserve"> </w:t>
       </w:r>
       <w:r>
         <w:rPr>
@@ -4305,7 +4590,28 @@
         <w:rPr>
           <w:rStyle w:val="NormalTok"/>
         </w:rPr>
-        <w:t xml:space="preserve">.categorical </w:t>
+        <w:t xml:space="preserve">.categorical}</w:t>
+      </w:r>
+      <w:r>
+        <w:br/>
+      </w:r>
+      <w:r>
+        <w:rPr>
+          <w:rStyle w:val="NormalTok"/>
+        </w:rPr>
+        <w:t xml:space="preserve">        </w:t>
+      </w:r>
+      <w:r>
+        <w:rPr>
+          <w:rStyle w:val="VariableTok"/>
+        </w:rPr>
+        <w:t xml:space="preserve">self</w:t>
+      </w:r>
+      <w:r>
+        <w:rPr>
+          <w:rStyle w:val="NormalTok"/>
+        </w:rPr>
+        <w:t xml:space="preserve">.columns_ </w:t>
       </w:r>
       <w:r>
         <w:rPr>
@@ -4329,19 +4635,253 @@
         <w:rPr>
           <w:rStyle w:val="NormalTok"/>
         </w:rPr>
-        <w:t xml:space="preserve">(numeric), </w:t>
+        <w:t xml:space="preserve">(X.columns)</w:t>
+      </w:r>
+      <w:r>
+        <w:br/>
+      </w:r>
+      <w:r>
+        <w:rPr>
+          <w:rStyle w:val="NormalTok"/>
+        </w:rPr>
+        <w:t xml:space="preserve">        </w:t>
+      </w:r>
+      <w:r>
+        <w:rPr>
+          <w:rStyle w:val="ControlFlowTok"/>
+        </w:rPr>
+        <w:t xml:space="preserve">return</w:t>
+      </w:r>
+      <w:r>
+        <w:rPr>
+          <w:rStyle w:val="NormalTok"/>
+        </w:rPr>
+        <w:t xml:space="preserve"> </w:t>
+      </w:r>
+      <w:r>
+        <w:rPr>
+          <w:rStyle w:val="VariableTok"/>
+        </w:rPr>
+        <w:t xml:space="preserve">self</w:t>
+      </w:r>
+      <w:r>
+        <w:br/>
+      </w:r>
+      <w:r>
+        <w:br/>
+      </w:r>
+      <w:r>
+        <w:rPr>
+          <w:rStyle w:val="NormalTok"/>
+        </w:rPr>
+        <w:t xml:space="preserve">    </w:t>
+      </w:r>
+      <w:r>
+        <w:rPr>
+          <w:rStyle w:val="KeywordTok"/>
+        </w:rPr>
+        <w:t xml:space="preserve">def</w:t>
+      </w:r>
+      <w:r>
+        <w:rPr>
+          <w:rStyle w:val="NormalTok"/>
+        </w:rPr>
+        <w:t xml:space="preserve"> transform(</w:t>
+      </w:r>
+      <w:r>
+        <w:rPr>
+          <w:rStyle w:val="VariableTok"/>
+        </w:rPr>
+        <w:t xml:space="preserve">self</w:t>
+      </w:r>
+      <w:r>
+        <w:rPr>
+          <w:rStyle w:val="NormalTok"/>
+        </w:rPr>
+        <w:t xml:space="preserve">, X):</w:t>
+      </w:r>
+      <w:r>
+        <w:br/>
+      </w:r>
+      <w:r>
+        <w:rPr>
+          <w:rStyle w:val="NormalTok"/>
+        </w:rPr>
+        <w:t xml:space="preserve">        X </w:t>
+      </w:r>
+      <w:r>
+        <w:rPr>
+          <w:rStyle w:val="OperatorTok"/>
+        </w:rPr>
+        <w:t xml:space="preserve">=</w:t>
+      </w:r>
+      <w:r>
+        <w:rPr>
+          <w:rStyle w:val="NormalTok"/>
+        </w:rPr>
+        <w:t xml:space="preserve"> X.copy()</w:t>
+      </w:r>
+      <w:r>
+        <w:br/>
+      </w:r>
+      <w:r>
+        <w:rPr>
+          <w:rStyle w:val="NormalTok"/>
+        </w:rPr>
+        <w:t xml:space="preserve">        </w:t>
+      </w:r>
+      <w:r>
+        <w:rPr>
+          <w:rStyle w:val="ControlFlowTok"/>
+        </w:rPr>
+        <w:t xml:space="preserve">for</w:t>
+      </w:r>
+      <w:r>
+        <w:rPr>
+          <w:rStyle w:val="NormalTok"/>
+        </w:rPr>
+        <w:t xml:space="preserve"> c </w:t>
+      </w:r>
+      <w:r>
+        <w:rPr>
+          <w:rStyle w:val="KeywordTok"/>
+        </w:rPr>
+        <w:t xml:space="preserve">in</w:t>
+      </w:r>
+      <w:r>
+        <w:rPr>
+          <w:rStyle w:val="NormalTok"/>
+        </w:rPr>
+        <w:t xml:space="preserve"> </w:t>
+      </w:r>
+      <w:r>
+        <w:rPr>
+          <w:rStyle w:val="VariableTok"/>
+        </w:rPr>
+        <w:t xml:space="preserve">self</w:t>
+      </w:r>
+      <w:r>
+        <w:rPr>
+          <w:rStyle w:val="NormalTok"/>
+        </w:rPr>
+        <w:t xml:space="preserve">.numeric </w:t>
+      </w:r>
+      <w:r>
+        <w:rPr>
+          <w:rStyle w:val="OperatorTok"/>
+        </w:rPr>
+        <w:t xml:space="preserve">+</w:t>
+      </w:r>
+      <w:r>
+        <w:rPr>
+          <w:rStyle w:val="NormalTok"/>
+        </w:rPr>
+        <w:t xml:space="preserve"> </w:t>
+      </w:r>
+      <w:r>
+        <w:rPr>
+          <w:rStyle w:val="VariableTok"/>
+        </w:rPr>
+        <w:t xml:space="preserve">self</w:t>
+      </w:r>
+      <w:r>
+        <w:rPr>
+          <w:rStyle w:val="NormalTok"/>
+        </w:rPr>
+        <w:t xml:space="preserve">.categorical:</w:t>
+      </w:r>
+      <w:r>
+        <w:br/>
+      </w:r>
+      <w:r>
+        <w:rPr>
+          <w:rStyle w:val="NormalTok"/>
+        </w:rPr>
+        <w:t xml:space="preserve">            </w:t>
+      </w:r>
+      <w:r>
+        <w:rPr>
+          <w:rStyle w:val="ControlFlowTok"/>
+        </w:rPr>
+        <w:t xml:space="preserve">if</w:t>
+      </w:r>
+      <w:r>
+        <w:rPr>
+          <w:rStyle w:val="NormalTok"/>
+        </w:rPr>
+        <w:t xml:space="preserve"> </w:t>
+      </w:r>
+      <w:r>
+        <w:rPr>
+          <w:rStyle w:val="VariableTok"/>
+        </w:rPr>
+        <w:t xml:space="preserve">self</w:t>
+      </w:r>
+      <w:r>
+        <w:rPr>
+          <w:rStyle w:val="NormalTok"/>
+        </w:rPr>
+        <w:t xml:space="preserve">.indicator </w:t>
+      </w:r>
+      <w:r>
+        <w:rPr>
+          <w:rStyle w:val="KeywordTok"/>
+        </w:rPr>
+        <w:t xml:space="preserve">and</w:t>
+      </w:r>
+      <w:r>
+        <w:rPr>
+          <w:rStyle w:val="NormalTok"/>
+        </w:rPr>
+        <w:t xml:space="preserve"> X[c].isna().</w:t>
       </w:r>
       <w:r>
         <w:rPr>
           <w:rStyle w:val="BuiltInTok"/>
         </w:rPr>
-        <w:t xml:space="preserve">list</w:t>
-      </w:r>
-      <w:r>
-        <w:rPr>
-          <w:rStyle w:val="NormalTok"/>
-        </w:rPr>
-        <w:t xml:space="preserve">(categorical)</w:t>
+        <w:t xml:space="preserve">any</w:t>
+      </w:r>
+      <w:r>
+        <w:rPr>
+          <w:rStyle w:val="NormalTok"/>
+        </w:rPr>
+        <w:t xml:space="preserve">() </w:t>
+      </w:r>
+      <w:r>
+        <w:rPr>
+          <w:rStyle w:val="KeywordTok"/>
+        </w:rPr>
+        <w:t xml:space="preserve">or</w:t>
+      </w:r>
+      <w:r>
+        <w:rPr>
+          <w:rStyle w:val="NormalTok"/>
+        </w:rPr>
+        <w:t xml:space="preserve"> c </w:t>
+      </w:r>
+      <w:r>
+        <w:rPr>
+          <w:rStyle w:val="KeywordTok"/>
+        </w:rPr>
+        <w:t xml:space="preserve">in</w:t>
+      </w:r>
+      <w:r>
+        <w:rPr>
+          <w:rStyle w:val="NormalTok"/>
+        </w:rPr>
+        <w:t xml:space="preserve"> </w:t>
+      </w:r>
+      <w:r>
+        <w:rPr>
+          <w:rStyle w:val="VariableTok"/>
+        </w:rPr>
+        <w:t xml:space="preserve">self</w:t>
+      </w:r>
+      <w:r>
+        <w:rPr>
+          <w:rStyle w:val="NormalTok"/>
+        </w:rPr>
+        <w:t xml:space="preserve">.structural:</w:t>
       </w:r>
       <w:r>
         <w:br/>
@@ -4350,10 +4890,103 @@
         <w:rPr>
           <w:rStyle w:val="NormalTok"/>
         </w:rPr>
+        <w:t xml:space="preserve">                X[</w:t>
+      </w:r>
+      <w:r>
+        <w:rPr>
+          <w:rStyle w:val="SpecialStringTok"/>
+        </w:rPr>
+        <w:t xml:space="preserve">f"</w:t>
+      </w:r>
+      <w:r>
+        <w:rPr>
+          <w:rStyle w:val="SpecialCharTok"/>
+        </w:rPr>
+        <w:t xml:space="preserve">{</w:t>
+      </w:r>
+      <w:r>
+        <w:rPr>
+          <w:rStyle w:val="NormalTok"/>
+        </w:rPr>
+        <w:t xml:space="preserve">c</w:t>
+      </w:r>
+      <w:r>
+        <w:rPr>
+          <w:rStyle w:val="SpecialCharTok"/>
+        </w:rPr>
+        <w:t xml:space="preserve">}</w:t>
+      </w:r>
+      <w:r>
+        <w:rPr>
+          <w:rStyle w:val="SpecialStringTok"/>
+        </w:rPr>
+        <w:t xml:space="preserve">__missing"</w:t>
+      </w:r>
+      <w:r>
+        <w:rPr>
+          <w:rStyle w:val="NormalTok"/>
+        </w:rPr>
+        <w:t xml:space="preserve">] </w:t>
+      </w:r>
+      <w:r>
+        <w:rPr>
+          <w:rStyle w:val="OperatorTok"/>
+        </w:rPr>
+        <w:t xml:space="preserve">=</w:t>
+      </w:r>
+      <w:r>
+        <w:rPr>
+          <w:rStyle w:val="NormalTok"/>
+        </w:rPr>
+        <w:t xml:space="preserve"> X[c].isna().astype(</w:t>
+      </w:r>
+      <w:r>
+        <w:rPr>
+          <w:rStyle w:val="BuiltInTok"/>
+        </w:rPr>
+        <w:t xml:space="preserve">int</w:t>
+      </w:r>
+      <w:r>
+        <w:rPr>
+          <w:rStyle w:val="NormalTok"/>
+        </w:rPr>
+        <w:t xml:space="preserve">)</w:t>
+      </w:r>
+      <w:r>
+        <w:br/>
+      </w:r>
+      <w:r>
+        <w:rPr>
+          <w:rStyle w:val="NormalTok"/>
+        </w:rPr>
         <w:t xml:space="preserve">        </w:t>
       </w:r>
       <w:r>
         <w:rPr>
+          <w:rStyle w:val="ControlFlowTok"/>
+        </w:rPr>
+        <w:t xml:space="preserve">for</w:t>
+      </w:r>
+      <w:r>
+        <w:rPr>
+          <w:rStyle w:val="NormalTok"/>
+        </w:rPr>
+        <w:t xml:space="preserve"> c </w:t>
+      </w:r>
+      <w:r>
+        <w:rPr>
+          <w:rStyle w:val="KeywordTok"/>
+        </w:rPr>
+        <w:t xml:space="preserve">in</w:t>
+      </w:r>
+      <w:r>
+        <w:rPr>
+          <w:rStyle w:val="NormalTok"/>
+        </w:rPr>
+        <w:t xml:space="preserve"> </w:t>
+      </w:r>
+      <w:r>
+        <w:rPr>
           <w:rStyle w:val="VariableTok"/>
         </w:rPr>
         <w:t xml:space="preserve">self</w:t>
@@ -4362,7 +4995,28 @@
         <w:rPr>
           <w:rStyle w:val="NormalTok"/>
         </w:rPr>
-        <w:t xml:space="preserve">.structural, </w:t>
+        <w:t xml:space="preserve">.structural:</w:t>
+      </w:r>
+      <w:r>
+        <w:br/>
+      </w:r>
+      <w:r>
+        <w:rPr>
+          <w:rStyle w:val="NormalTok"/>
+        </w:rPr>
+        <w:t xml:space="preserve">            X[c] </w:t>
+      </w:r>
+      <w:r>
+        <w:rPr>
+          <w:rStyle w:val="OperatorTok"/>
+        </w:rPr>
+        <w:t xml:space="preserve">=</w:t>
+      </w:r>
+      <w:r>
+        <w:rPr>
+          <w:rStyle w:val="NormalTok"/>
+        </w:rPr>
+        <w:t xml:space="preserve"> X[c].fillna(</w:t>
       </w:r>
       <w:r>
         <w:rPr>
@@ -4374,7 +5028,73 @@
         <w:rPr>
           <w:rStyle w:val="NormalTok"/>
         </w:rPr>
-        <w:t xml:space="preserve">.indicator </w:t>
+        <w:t xml:space="preserve">.medians_.get(c, </w:t>
+      </w:r>
+      <w:r>
+        <w:rPr>
+          <w:rStyle w:val="DecValTok"/>
+        </w:rPr>
+        <w:t xml:space="preserve">0</w:t>
+      </w:r>
+      <w:r>
+        <w:rPr>
+          <w:rStyle w:val="NormalTok"/>
+        </w:rPr>
+        <w:t xml:space="preserve">))</w:t>
+      </w:r>
+      <w:r>
+        <w:br/>
+      </w:r>
+      <w:r>
+        <w:rPr>
+          <w:rStyle w:val="NormalTok"/>
+        </w:rPr>
+        <w:t xml:space="preserve">        </w:t>
+      </w:r>
+      <w:r>
+        <w:rPr>
+          <w:rStyle w:val="ControlFlowTok"/>
+        </w:rPr>
+        <w:t xml:space="preserve">for</w:t>
+      </w:r>
+      <w:r>
+        <w:rPr>
+          <w:rStyle w:val="NormalTok"/>
+        </w:rPr>
+        <w:t xml:space="preserve"> c </w:t>
+      </w:r>
+      <w:r>
+        <w:rPr>
+          <w:rStyle w:val="KeywordTok"/>
+        </w:rPr>
+        <w:t xml:space="preserve">in</w:t>
+      </w:r>
+      <w:r>
+        <w:rPr>
+          <w:rStyle w:val="NormalTok"/>
+        </w:rPr>
+        <w:t xml:space="preserve"> </w:t>
+      </w:r>
+      <w:r>
+        <w:rPr>
+          <w:rStyle w:val="VariableTok"/>
+        </w:rPr>
+        <w:t xml:space="preserve">self</w:t>
+      </w:r>
+      <w:r>
+        <w:rPr>
+          <w:rStyle w:val="NormalTok"/>
+        </w:rPr>
+        <w:t xml:space="preserve">.numeric:</w:t>
+      </w:r>
+      <w:r>
+        <w:br/>
+      </w:r>
+      <w:r>
+        <w:rPr>
+          <w:rStyle w:val="NormalTok"/>
+        </w:rPr>
+        <w:t xml:space="preserve">            X[c] </w:t>
       </w:r>
       <w:r>
         <w:rPr>
@@ -4386,55 +5106,73 @@
         <w:rPr>
           <w:rStyle w:val="NormalTok"/>
         </w:rPr>
-        <w:t xml:space="preserve"> </w:t>
-      </w:r>
-      <w:r>
-        <w:rPr>
-          <w:rStyle w:val="BuiltInTok"/>
-        </w:rPr>
-        <w:t xml:space="preserve">list</w:t>
-      </w:r>
-      <w:r>
-        <w:rPr>
-          <w:rStyle w:val="NormalTok"/>
-        </w:rPr>
-        <w:t xml:space="preserve">(structural), indicator</w:t>
+        <w:t xml:space="preserve"> X[c].fillna(</w:t>
+      </w:r>
+      <w:r>
+        <w:rPr>
+          <w:rStyle w:val="VariableTok"/>
+        </w:rPr>
+        <w:t xml:space="preserve">self</w:t>
+      </w:r>
+      <w:r>
+        <w:rPr>
+          <w:rStyle w:val="NormalTok"/>
+        </w:rPr>
+        <w:t xml:space="preserve">.medians_[c])</w:t>
       </w:r>
       <w:r>
         <w:br/>
       </w:r>
       <w:r>
+        <w:rPr>
+          <w:rStyle w:val="NormalTok"/>
+        </w:rPr>
+        <w:t xml:space="preserve">        </w:t>
+      </w:r>
+      <w:r>
+        <w:rPr>
+          <w:rStyle w:val="ControlFlowTok"/>
+        </w:rPr>
+        <w:t xml:space="preserve">for</w:t>
+      </w:r>
+      <w:r>
+        <w:rPr>
+          <w:rStyle w:val="NormalTok"/>
+        </w:rPr>
+        <w:t xml:space="preserve"> c </w:t>
+      </w:r>
+      <w:r>
+        <w:rPr>
+          <w:rStyle w:val="KeywordTok"/>
+        </w:rPr>
+        <w:t xml:space="preserve">in</w:t>
+      </w:r>
+      <w:r>
+        <w:rPr>
+          <w:rStyle w:val="NormalTok"/>
+        </w:rPr>
+        <w:t xml:space="preserve"> </w:t>
+      </w:r>
+      <w:r>
+        <w:rPr>
+          <w:rStyle w:val="VariableTok"/>
+        </w:rPr>
+        <w:t xml:space="preserve">self</w:t>
+      </w:r>
+      <w:r>
+        <w:rPr>
+          <w:rStyle w:val="NormalTok"/>
+        </w:rPr>
+        <w:t xml:space="preserve">.categorical:</w:t>
+      </w:r>
+      <w:r>
         <w:br/>
       </w:r>
       <w:r>
         <w:rPr>
           <w:rStyle w:val="NormalTok"/>
         </w:rPr>
-        <w:t xml:space="preserve">    </w:t>
-      </w:r>
-      <w:r>
-        <w:rPr>
-          <w:rStyle w:val="KeywordTok"/>
-        </w:rPr>
-        <w:t xml:space="preserve">def</w:t>
-      </w:r>
-      <w:r>
-        <w:rPr>
-          <w:rStyle w:val="NormalTok"/>
-        </w:rPr>
-        <w:t xml:space="preserve"> fit(</w:t>
-      </w:r>
-      <w:r>
-        <w:rPr>
-          <w:rStyle w:val="VariableTok"/>
-        </w:rPr>
-        <w:t xml:space="preserve">self</w:t>
-      </w:r>
-      <w:r>
-        <w:rPr>
-          <w:rStyle w:val="NormalTok"/>
-        </w:rPr>
-        <w:t xml:space="preserve">, X, y</w:t>
+        <w:t xml:space="preserve">            X[c] </w:t>
       </w:r>
       <w:r>
         <w:rPr>
@@ -4444,15 +5182,21 @@
       </w:r>
       <w:r>
         <w:rPr>
-          <w:rStyle w:val="VariableTok"/>
-        </w:rPr>
-        <w:t xml:space="preserve">None</w:t>
-      </w:r>
-      <w:r>
-        <w:rPr>
-          <w:rStyle w:val="NormalTok"/>
-        </w:rPr>
-        <w:t xml:space="preserve">):</w:t>
+          <w:rStyle w:val="NormalTok"/>
+        </w:rPr>
+        <w:t xml:space="preserve"> X[c].fillna(</w:t>
+      </w:r>
+      <w:r>
+        <w:rPr>
+          <w:rStyle w:val="StringTok"/>
+        </w:rPr>
+        <w:t xml:space="preserve">"not_reported"</w:t>
+      </w:r>
+      <w:r>
+        <w:rPr>
+          <w:rStyle w:val="NormalTok"/>
+        </w:rPr>
+        <w:t xml:space="preserve">)</w:t>
       </w:r>
       <w:r>
         <w:br/>
@@ -4465,803 +5209,14 @@
       </w:r>
       <w:r>
         <w:rPr>
-          <w:rStyle w:val="VariableTok"/>
-        </w:rPr>
-        <w:t xml:space="preserve">self</w:t>
-      </w:r>
-      <w:r>
-        <w:rPr>
-          <w:rStyle w:val="NormalTok"/>
-        </w:rPr>
-        <w:t xml:space="preserve">.medians_ </w:t>
-      </w:r>
-      <w:r>
-        <w:rPr>
-          <w:rStyle w:val="OperatorTok"/>
-        </w:rPr>
-        <w:t xml:space="preserve">=</w:t>
-      </w:r>
-      <w:r>
-        <w:rPr>
-          <w:rStyle w:val="NormalTok"/>
-        </w:rPr>
-        <w:t xml:space="preserve"> X[</w:t>
-      </w:r>
-      <w:r>
-        <w:rPr>
-          <w:rStyle w:val="VariableTok"/>
-        </w:rPr>
-        <w:t xml:space="preserve">self</w:t>
-      </w:r>
-      <w:r>
-        <w:rPr>
-          <w:rStyle w:val="NormalTok"/>
-        </w:rPr>
-        <w:t xml:space="preserve">.numeric].median()</w:t>
-      </w:r>
-      <w:r>
-        <w:br/>
-      </w:r>
-      <w:r>
-        <w:rPr>
-          <w:rStyle w:val="NormalTok"/>
-        </w:rPr>
-        <w:t xml:space="preserve">        </w:t>
-      </w:r>
-      <w:r>
-        <w:rPr>
-          <w:rStyle w:val="VariableTok"/>
-        </w:rPr>
-        <w:t xml:space="preserve">self</w:t>
-      </w:r>
-      <w:r>
-        <w:rPr>
-          <w:rStyle w:val="NormalTok"/>
-        </w:rPr>
-        <w:t xml:space="preserve">.modes_ </w:t>
-      </w:r>
-      <w:r>
-        <w:rPr>
-          <w:rStyle w:val="OperatorTok"/>
-        </w:rPr>
-        <w:t xml:space="preserve">=</w:t>
-      </w:r>
-      <w:r>
-        <w:rPr>
-          <w:rStyle w:val="NormalTok"/>
-        </w:rPr>
-        <w:t xml:space="preserve"> {c: (X[c].mode().iloc[</w:t>
-      </w:r>
-      <w:r>
-        <w:rPr>
-          <w:rStyle w:val="DecValTok"/>
-        </w:rPr>
-        <w:t xml:space="preserve">0</w:t>
-      </w:r>
-      <w:r>
-        <w:rPr>
-          <w:rStyle w:val="NormalTok"/>
-        </w:rPr>
-        <w:t xml:space="preserve">] </w:t>
-      </w:r>
-      <w:r>
-        <w:rPr>
           <w:rStyle w:val="ControlFlowTok"/>
         </w:rPr>
-        <w:t xml:space="preserve">if</w:t>
-      </w:r>
-      <w:r>
-        <w:rPr>
-          <w:rStyle w:val="NormalTok"/>
-        </w:rPr>
-        <w:t xml:space="preserve"> X[c].notna().</w:t>
-      </w:r>
-      <w:r>
-        <w:rPr>
-          <w:rStyle w:val="BuiltInTok"/>
-        </w:rPr>
-        <w:t xml:space="preserve">any</w:t>
-      </w:r>
-      <w:r>
-        <w:rPr>
-          <w:rStyle w:val="NormalTok"/>
-        </w:rPr>
-        <w:t xml:space="preserve">() </w:t>
-      </w:r>
-      <w:r>
-        <w:rPr>
-          <w:rStyle w:val="ControlFlowTok"/>
-        </w:rPr>
-        <w:t xml:space="preserve">else</w:t>
-      </w:r>
-      <w:r>
-        <w:rPr>
-          <w:rStyle w:val="NormalTok"/>
-        </w:rPr>
-        <w:t xml:space="preserve"> </w:t>
-      </w:r>
-      <w:r>
-        <w:rPr>
-          <w:rStyle w:val="StringTok"/>
-        </w:rPr>
-        <w:t xml:space="preserve">"unknown"</w:t>
-      </w:r>
-      <w:r>
-        <w:rPr>
-          <w:rStyle w:val="NormalTok"/>
-        </w:rPr>
-        <w:t xml:space="preserve">)</w:t>
-      </w:r>
-      <w:r>
-        <w:br/>
-      </w:r>
-      <w:r>
-        <w:rPr>
-          <w:rStyle w:val="NormalTok"/>
-        </w:rPr>
-        <w:t xml:space="preserve">                       </w:t>
-      </w:r>
-      <w:r>
-        <w:rPr>
-          <w:rStyle w:val="ControlFlowTok"/>
-        </w:rPr>
-        <w:t xml:space="preserve">for</w:t>
-      </w:r>
-      <w:r>
-        <w:rPr>
-          <w:rStyle w:val="NormalTok"/>
-        </w:rPr>
-        <w:t xml:space="preserve"> c </w:t>
-      </w:r>
-      <w:r>
-        <w:rPr>
-          <w:rStyle w:val="KeywordTok"/>
-        </w:rPr>
-        <w:t xml:space="preserve">in</w:t>
-      </w:r>
-      <w:r>
-        <w:rPr>
-          <w:rStyle w:val="NormalTok"/>
-        </w:rPr>
-        <w:t xml:space="preserve"> </w:t>
-      </w:r>
-      <w:r>
-        <w:rPr>
-          <w:rStyle w:val="VariableTok"/>
-        </w:rPr>
-        <w:t xml:space="preserve">self</w:t>
-      </w:r>
-      <w:r>
-        <w:rPr>
-          <w:rStyle w:val="NormalTok"/>
-        </w:rPr>
-        <w:t xml:space="preserve">.categorical}</w:t>
-      </w:r>
-      <w:r>
-        <w:br/>
-      </w:r>
-      <w:r>
-        <w:rPr>
-          <w:rStyle w:val="NormalTok"/>
-        </w:rPr>
-        <w:t xml:space="preserve">        </w:t>
-      </w:r>
-      <w:r>
-        <w:rPr>
-          <w:rStyle w:val="VariableTok"/>
-        </w:rPr>
-        <w:t xml:space="preserve">self</w:t>
-      </w:r>
-      <w:r>
-        <w:rPr>
-          <w:rStyle w:val="NormalTok"/>
-        </w:rPr>
-        <w:t xml:space="preserve">.columns_ </w:t>
-      </w:r>
-      <w:r>
-        <w:rPr>
-          <w:rStyle w:val="OperatorTok"/>
-        </w:rPr>
-        <w:t xml:space="preserve">=</w:t>
-      </w:r>
-      <w:r>
-        <w:rPr>
-          <w:rStyle w:val="NormalTok"/>
-        </w:rPr>
-        <w:t xml:space="preserve"> </w:t>
-      </w:r>
-      <w:r>
-        <w:rPr>
-          <w:rStyle w:val="BuiltInTok"/>
-        </w:rPr>
-        <w:t xml:space="preserve">list</w:t>
-      </w:r>
-      <w:r>
-        <w:rPr>
-          <w:rStyle w:val="NormalTok"/>
-        </w:rPr>
-        <w:t xml:space="preserve">(X.columns)</w:t>
-      </w:r>
-      <w:r>
-        <w:br/>
-      </w:r>
-      <w:r>
-        <w:rPr>
-          <w:rStyle w:val="NormalTok"/>
-        </w:rPr>
-        <w:t xml:space="preserve">        </w:t>
-      </w:r>
-      <w:r>
-        <w:rPr>
-          <w:rStyle w:val="ControlFlowTok"/>
-        </w:rPr>
         <w:t xml:space="preserve">return</w:t>
       </w:r>
       <w:r>
         <w:rPr>
           <w:rStyle w:val="NormalTok"/>
         </w:rPr>
-        <w:t xml:space="preserve"> </w:t>
-      </w:r>
-      <w:r>
-        <w:rPr>
-          <w:rStyle w:val="VariableTok"/>
-        </w:rPr>
-        <w:t xml:space="preserve">self</w:t>
-      </w:r>
-      <w:r>
-        <w:br/>
-      </w:r>
-      <w:r>
-        <w:br/>
-      </w:r>
-      <w:r>
-        <w:rPr>
-          <w:rStyle w:val="NormalTok"/>
-        </w:rPr>
-        <w:t xml:space="preserve">    </w:t>
-      </w:r>
-      <w:r>
-        <w:rPr>
-          <w:rStyle w:val="KeywordTok"/>
-        </w:rPr>
-        <w:t xml:space="preserve">def</w:t>
-      </w:r>
-      <w:r>
-        <w:rPr>
-          <w:rStyle w:val="NormalTok"/>
-        </w:rPr>
-        <w:t xml:space="preserve"> transform(</w:t>
-      </w:r>
-      <w:r>
-        <w:rPr>
-          <w:rStyle w:val="VariableTok"/>
-        </w:rPr>
-        <w:t xml:space="preserve">self</w:t>
-      </w:r>
-      <w:r>
-        <w:rPr>
-          <w:rStyle w:val="NormalTok"/>
-        </w:rPr>
-        <w:t xml:space="preserve">, X):</w:t>
-      </w:r>
-      <w:r>
-        <w:br/>
-      </w:r>
-      <w:r>
-        <w:rPr>
-          <w:rStyle w:val="NormalTok"/>
-        </w:rPr>
-        <w:t xml:space="preserve">        X </w:t>
-      </w:r>
-      <w:r>
-        <w:rPr>
-          <w:rStyle w:val="OperatorTok"/>
-        </w:rPr>
-        <w:t xml:space="preserve">=</w:t>
-      </w:r>
-      <w:r>
-        <w:rPr>
-          <w:rStyle w:val="NormalTok"/>
-        </w:rPr>
-        <w:t xml:space="preserve"> X.copy()</w:t>
-      </w:r>
-      <w:r>
-        <w:br/>
-      </w:r>
-      <w:r>
-        <w:rPr>
-          <w:rStyle w:val="NormalTok"/>
-        </w:rPr>
-        <w:t xml:space="preserve">        </w:t>
-      </w:r>
-      <w:r>
-        <w:rPr>
-          <w:rStyle w:val="ControlFlowTok"/>
-        </w:rPr>
-        <w:t xml:space="preserve">for</w:t>
-      </w:r>
-      <w:r>
-        <w:rPr>
-          <w:rStyle w:val="NormalTok"/>
-        </w:rPr>
-        <w:t xml:space="preserve"> c </w:t>
-      </w:r>
-      <w:r>
-        <w:rPr>
-          <w:rStyle w:val="KeywordTok"/>
-        </w:rPr>
-        <w:t xml:space="preserve">in</w:t>
-      </w:r>
-      <w:r>
-        <w:rPr>
-          <w:rStyle w:val="NormalTok"/>
-        </w:rPr>
-        <w:t xml:space="preserve"> </w:t>
-      </w:r>
-      <w:r>
-        <w:rPr>
-          <w:rStyle w:val="VariableTok"/>
-        </w:rPr>
-        <w:t xml:space="preserve">self</w:t>
-      </w:r>
-      <w:r>
-        <w:rPr>
-          <w:rStyle w:val="NormalTok"/>
-        </w:rPr>
-        <w:t xml:space="preserve">.numeric </w:t>
-      </w:r>
-      <w:r>
-        <w:rPr>
-          <w:rStyle w:val="OperatorTok"/>
-        </w:rPr>
-        <w:t xml:space="preserve">+</w:t>
-      </w:r>
-      <w:r>
-        <w:rPr>
-          <w:rStyle w:val="NormalTok"/>
-        </w:rPr>
-        <w:t xml:space="preserve"> </w:t>
-      </w:r>
-      <w:r>
-        <w:rPr>
-          <w:rStyle w:val="VariableTok"/>
-        </w:rPr>
-        <w:t xml:space="preserve">self</w:t>
-      </w:r>
-      <w:r>
-        <w:rPr>
-          <w:rStyle w:val="NormalTok"/>
-        </w:rPr>
-        <w:t xml:space="preserve">.categorical:</w:t>
-      </w:r>
-      <w:r>
-        <w:br/>
-      </w:r>
-      <w:r>
-        <w:rPr>
-          <w:rStyle w:val="NormalTok"/>
-        </w:rPr>
-        <w:t xml:space="preserve">            </w:t>
-      </w:r>
-      <w:r>
-        <w:rPr>
-          <w:rStyle w:val="ControlFlowTok"/>
-        </w:rPr>
-        <w:t xml:space="preserve">if</w:t>
-      </w:r>
-      <w:r>
-        <w:rPr>
-          <w:rStyle w:val="NormalTok"/>
-        </w:rPr>
-        <w:t xml:space="preserve"> </w:t>
-      </w:r>
-      <w:r>
-        <w:rPr>
-          <w:rStyle w:val="VariableTok"/>
-        </w:rPr>
-        <w:t xml:space="preserve">self</w:t>
-      </w:r>
-      <w:r>
-        <w:rPr>
-          <w:rStyle w:val="NormalTok"/>
-        </w:rPr>
-        <w:t xml:space="preserve">.indicator </w:t>
-      </w:r>
-      <w:r>
-        <w:rPr>
-          <w:rStyle w:val="KeywordTok"/>
-        </w:rPr>
-        <w:t xml:space="preserve">and</w:t>
-      </w:r>
-      <w:r>
-        <w:rPr>
-          <w:rStyle w:val="NormalTok"/>
-        </w:rPr>
-        <w:t xml:space="preserve"> X[c].isna().</w:t>
-      </w:r>
-      <w:r>
-        <w:rPr>
-          <w:rStyle w:val="BuiltInTok"/>
-        </w:rPr>
-        <w:t xml:space="preserve">any</w:t>
-      </w:r>
-      <w:r>
-        <w:rPr>
-          <w:rStyle w:val="NormalTok"/>
-        </w:rPr>
-        <w:t xml:space="preserve">() </w:t>
-      </w:r>
-      <w:r>
-        <w:rPr>
-          <w:rStyle w:val="KeywordTok"/>
-        </w:rPr>
-        <w:t xml:space="preserve">or</w:t>
-      </w:r>
-      <w:r>
-        <w:rPr>
-          <w:rStyle w:val="NormalTok"/>
-        </w:rPr>
-        <w:t xml:space="preserve"> c </w:t>
-      </w:r>
-      <w:r>
-        <w:rPr>
-          <w:rStyle w:val="KeywordTok"/>
-        </w:rPr>
-        <w:t xml:space="preserve">in</w:t>
-      </w:r>
-      <w:r>
-        <w:rPr>
-          <w:rStyle w:val="NormalTok"/>
-        </w:rPr>
-        <w:t xml:space="preserve"> </w:t>
-      </w:r>
-      <w:r>
-        <w:rPr>
-          <w:rStyle w:val="VariableTok"/>
-        </w:rPr>
-        <w:t xml:space="preserve">self</w:t>
-      </w:r>
-      <w:r>
-        <w:rPr>
-          <w:rStyle w:val="NormalTok"/>
-        </w:rPr>
-        <w:t xml:space="preserve">.structural:</w:t>
-      </w:r>
-      <w:r>
-        <w:br/>
-      </w:r>
-      <w:r>
-        <w:rPr>
-          <w:rStyle w:val="NormalTok"/>
-        </w:rPr>
-        <w:t xml:space="preserve">                X[</w:t>
-      </w:r>
-      <w:r>
-        <w:rPr>
-          <w:rStyle w:val="SpecialStringTok"/>
-        </w:rPr>
-        <w:t xml:space="preserve">f"</w:t>
-      </w:r>
-      <w:r>
-        <w:rPr>
-          <w:rStyle w:val="SpecialCharTok"/>
-        </w:rPr>
-        <w:t xml:space="preserve">{</w:t>
-      </w:r>
-      <w:r>
-        <w:rPr>
-          <w:rStyle w:val="NormalTok"/>
-        </w:rPr>
-        <w:t xml:space="preserve">c</w:t>
-      </w:r>
-      <w:r>
-        <w:rPr>
-          <w:rStyle w:val="SpecialCharTok"/>
-        </w:rPr>
-        <w:t xml:space="preserve">}</w:t>
-      </w:r>
-      <w:r>
-        <w:rPr>
-          <w:rStyle w:val="SpecialStringTok"/>
-        </w:rPr>
-        <w:t xml:space="preserve">__missing"</w:t>
-      </w:r>
-      <w:r>
-        <w:rPr>
-          <w:rStyle w:val="NormalTok"/>
-        </w:rPr>
-        <w:t xml:space="preserve">] </w:t>
-      </w:r>
-      <w:r>
-        <w:rPr>
-          <w:rStyle w:val="OperatorTok"/>
-        </w:rPr>
-        <w:t xml:space="preserve">=</w:t>
-      </w:r>
-      <w:r>
-        <w:rPr>
-          <w:rStyle w:val="NormalTok"/>
-        </w:rPr>
-        <w:t xml:space="preserve"> X[c].isna().astype(</w:t>
-      </w:r>
-      <w:r>
-        <w:rPr>
-          <w:rStyle w:val="BuiltInTok"/>
-        </w:rPr>
-        <w:t xml:space="preserve">int</w:t>
-      </w:r>
-      <w:r>
-        <w:rPr>
-          <w:rStyle w:val="NormalTok"/>
-        </w:rPr>
-        <w:t xml:space="preserve">)</w:t>
-      </w:r>
-      <w:r>
-        <w:br/>
-      </w:r>
-      <w:r>
-        <w:rPr>
-          <w:rStyle w:val="NormalTok"/>
-        </w:rPr>
-        <w:t xml:space="preserve">        </w:t>
-      </w:r>
-      <w:r>
-        <w:rPr>
-          <w:rStyle w:val="ControlFlowTok"/>
-        </w:rPr>
-        <w:t xml:space="preserve">for</w:t>
-      </w:r>
-      <w:r>
-        <w:rPr>
-          <w:rStyle w:val="NormalTok"/>
-        </w:rPr>
-        <w:t xml:space="preserve"> c </w:t>
-      </w:r>
-      <w:r>
-        <w:rPr>
-          <w:rStyle w:val="KeywordTok"/>
-        </w:rPr>
-        <w:t xml:space="preserve">in</w:t>
-      </w:r>
-      <w:r>
-        <w:rPr>
-          <w:rStyle w:val="NormalTok"/>
-        </w:rPr>
-        <w:t xml:space="preserve"> </w:t>
-      </w:r>
-      <w:r>
-        <w:rPr>
-          <w:rStyle w:val="VariableTok"/>
-        </w:rPr>
-        <w:t xml:space="preserve">self</w:t>
-      </w:r>
-      <w:r>
-        <w:rPr>
-          <w:rStyle w:val="NormalTok"/>
-        </w:rPr>
-        <w:t xml:space="preserve">.structural:</w:t>
-      </w:r>
-      <w:r>
-        <w:br/>
-      </w:r>
-      <w:r>
-        <w:rPr>
-          <w:rStyle w:val="NormalTok"/>
-        </w:rPr>
-        <w:t xml:space="preserve">            X[c] </w:t>
-      </w:r>
-      <w:r>
-        <w:rPr>
-          <w:rStyle w:val="OperatorTok"/>
-        </w:rPr>
-        <w:t xml:space="preserve">=</w:t>
-      </w:r>
-      <w:r>
-        <w:rPr>
-          <w:rStyle w:val="NormalTok"/>
-        </w:rPr>
-        <w:t xml:space="preserve"> X[c].fillna(</w:t>
-      </w:r>
-      <w:r>
-        <w:rPr>
-          <w:rStyle w:val="VariableTok"/>
-        </w:rPr>
-        <w:t xml:space="preserve">self</w:t>
-      </w:r>
-      <w:r>
-        <w:rPr>
-          <w:rStyle w:val="NormalTok"/>
-        </w:rPr>
-        <w:t xml:space="preserve">.medians_.get(c, </w:t>
-      </w:r>
-      <w:r>
-        <w:rPr>
-          <w:rStyle w:val="DecValTok"/>
-        </w:rPr>
-        <w:t xml:space="preserve">0</w:t>
-      </w:r>
-      <w:r>
-        <w:rPr>
-          <w:rStyle w:val="NormalTok"/>
-        </w:rPr>
-        <w:t xml:space="preserve">))</w:t>
-      </w:r>
-      <w:r>
-        <w:br/>
-      </w:r>
-      <w:r>
-        <w:rPr>
-          <w:rStyle w:val="NormalTok"/>
-        </w:rPr>
-        <w:t xml:space="preserve">        </w:t>
-      </w:r>
-      <w:r>
-        <w:rPr>
-          <w:rStyle w:val="ControlFlowTok"/>
-        </w:rPr>
-        <w:t xml:space="preserve">for</w:t>
-      </w:r>
-      <w:r>
-        <w:rPr>
-          <w:rStyle w:val="NormalTok"/>
-        </w:rPr>
-        <w:t xml:space="preserve"> c </w:t>
-      </w:r>
-      <w:r>
-        <w:rPr>
-          <w:rStyle w:val="KeywordTok"/>
-        </w:rPr>
-        <w:t xml:space="preserve">in</w:t>
-      </w:r>
-      <w:r>
-        <w:rPr>
-          <w:rStyle w:val="NormalTok"/>
-        </w:rPr>
-        <w:t xml:space="preserve"> </w:t>
-      </w:r>
-      <w:r>
-        <w:rPr>
-          <w:rStyle w:val="VariableTok"/>
-        </w:rPr>
-        <w:t xml:space="preserve">self</w:t>
-      </w:r>
-      <w:r>
-        <w:rPr>
-          <w:rStyle w:val="NormalTok"/>
-        </w:rPr>
-        <w:t xml:space="preserve">.numeric:</w:t>
-      </w:r>
-      <w:r>
-        <w:br/>
-      </w:r>
-      <w:r>
-        <w:rPr>
-          <w:rStyle w:val="NormalTok"/>
-        </w:rPr>
-        <w:t xml:space="preserve">            X[c] </w:t>
-      </w:r>
-      <w:r>
-        <w:rPr>
-          <w:rStyle w:val="OperatorTok"/>
-        </w:rPr>
-        <w:t xml:space="preserve">=</w:t>
-      </w:r>
-      <w:r>
-        <w:rPr>
-          <w:rStyle w:val="NormalTok"/>
-        </w:rPr>
-        <w:t xml:space="preserve"> X[c].fillna(</w:t>
-      </w:r>
-      <w:r>
-        <w:rPr>
-          <w:rStyle w:val="VariableTok"/>
-        </w:rPr>
-        <w:t xml:space="preserve">self</w:t>
-      </w:r>
-      <w:r>
-        <w:rPr>
-          <w:rStyle w:val="NormalTok"/>
-        </w:rPr>
-        <w:t xml:space="preserve">.medians_[c])</w:t>
-      </w:r>
-      <w:r>
-        <w:br/>
-      </w:r>
-      <w:r>
-        <w:rPr>
-          <w:rStyle w:val="NormalTok"/>
-        </w:rPr>
-        <w:t xml:space="preserve">        </w:t>
-      </w:r>
-      <w:r>
-        <w:rPr>
-          <w:rStyle w:val="ControlFlowTok"/>
-        </w:rPr>
-        <w:t xml:space="preserve">for</w:t>
-      </w:r>
-      <w:r>
-        <w:rPr>
-          <w:rStyle w:val="NormalTok"/>
-        </w:rPr>
-        <w:t xml:space="preserve"> c </w:t>
-      </w:r>
-      <w:r>
-        <w:rPr>
-          <w:rStyle w:val="KeywordTok"/>
-        </w:rPr>
-        <w:t xml:space="preserve">in</w:t>
-      </w:r>
-      <w:r>
-        <w:rPr>
-          <w:rStyle w:val="NormalTok"/>
-        </w:rPr>
-        <w:t xml:space="preserve"> </w:t>
-      </w:r>
-      <w:r>
-        <w:rPr>
-          <w:rStyle w:val="VariableTok"/>
-        </w:rPr>
-        <w:t xml:space="preserve">self</w:t>
-      </w:r>
-      <w:r>
-        <w:rPr>
-          <w:rStyle w:val="NormalTok"/>
-        </w:rPr>
-        <w:t xml:space="preserve">.categorical:</w:t>
-      </w:r>
-      <w:r>
-        <w:br/>
-      </w:r>
-      <w:r>
-        <w:rPr>
-          <w:rStyle w:val="NormalTok"/>
-        </w:rPr>
-        <w:t xml:space="preserve">            X[c] </w:t>
-      </w:r>
-      <w:r>
-        <w:rPr>
-          <w:rStyle w:val="OperatorTok"/>
-        </w:rPr>
-        <w:t xml:space="preserve">=</w:t>
-      </w:r>
-      <w:r>
-        <w:rPr>
-          <w:rStyle w:val="NormalTok"/>
-        </w:rPr>
-        <w:t xml:space="preserve"> X[c].fillna(</w:t>
-      </w:r>
-      <w:r>
-        <w:rPr>
-          <w:rStyle w:val="StringTok"/>
-        </w:rPr>
-        <w:t xml:space="preserve">"not_reported"</w:t>
-      </w:r>
-      <w:r>
-        <w:rPr>
-          <w:rStyle w:val="NormalTok"/>
-        </w:rPr>
-        <w:t xml:space="preserve">)</w:t>
-      </w:r>
-      <w:r>
-        <w:br/>
-      </w:r>
-      <w:r>
-        <w:rPr>
-          <w:rStyle w:val="NormalTok"/>
-        </w:rPr>
-        <w:t xml:space="preserve">        </w:t>
-      </w:r>
-      <w:r>
-        <w:rPr>
-          <w:rStyle w:val="ControlFlowTok"/>
-        </w:rPr>
-        <w:t xml:space="preserve">return</w:t>
-      </w:r>
-      <w:r>
-        <w:rPr>
-          <w:rStyle w:val="NormalTok"/>
-        </w:rPr>
         <w:t xml:space="preserve"> X</w:t>
       </w:r>
     </w:p>
@@ -5288,7 +5243,7 @@
         <w:t xml:space="preserve"> </w:t>
       </w:r>
       <w:r>
-        <w:t xml:space="preserve">where the downstream use requires calibrated intervals rather than a ranking. The</w:t>
+        <w:t xml:space="preserve">where the downstream use requires calibrated intervals and not a ranking. The</w:t>
       </w:r>
       <w:r>
         <w:t xml:space="preserve"> </w:t>
@@ -5300,7 +5255,7 @@
         <w:t xml:space="preserve"> </w:t>
       </w:r>
       <w:r>
-        <w:t xml:space="preserve">production, which is an assumption that has to be monitored rather than believed, since a</w:t>
+        <w:t xml:space="preserve">production, an assumption that has to be monitored and not believed, since a</w:t>
       </w:r>
       <w:r>
         <w:t xml:space="preserve"> </w:t>
@@ -5752,7 +5707,7 @@
         <w:t xml:space="preserve"> </w:t>
       </w:r>
       <w:r>
-        <w:t xml:space="preserve">cost of each encoding choice can be quantified rather than asserted. Script:</w:t>
+        <w:t xml:space="preserve">cost of each encoding choice can be quantified, not asserted. Script:</w:t>
       </w:r>
       <w:r>
         <w:t xml:space="preserve"> </w:t>
@@ -6144,7 +6099,7 @@
         <w:pStyle w:val="BodyText"/>
       </w:pPr>
       <w:r>
-        <w:t xml:space="preserve">On scaling. Standardisation rather than min-max, because min-max is defined by the</w:t>
+        <w:t xml:space="preserve">On scaling. Standardisation in preference to min-max, because min-max is defined by the</w:t>
       </w:r>
       <w:r>
         <w:t xml:space="preserve"> </w:t>
@@ -6747,7 +6702,7 @@
         <w:t xml:space="preserve"> </w:t>
       </w:r>
       <w:r>
-        <w:t xml:space="preserve">0.0886 AUC, which is 12% of the model’s discrimination. The reason is visible in the</w:t>
+        <w:t xml:space="preserve">0.0886 AUC, or 12% of the model’s discrimination. The reason is visible in the</w:t>
       </w:r>
       <w:r>
         <w:t xml:space="preserve"> </w:t>
@@ -6858,7 +6813,7 @@
         <w:t xml:space="preserve"> </w:t>
       </w:r>
       <w:r>
-        <w:t xml:space="preserve">random forest costs 0.0161 AUC rather than 0.0886. A tree splits on thresholds and can</w:t>
+        <w:t xml:space="preserve">random forest costs 0.0161 AUC against 0.0886. A tree splits on thresholds and can</w:t>
       </w:r>
       <w:r>
         <w:t xml:space="preserve"> </w:t>
@@ -6894,7 +6849,7 @@
         <w:t xml:space="preserve"> </w:t>
       </w:r>
       <w:r>
-        <w:t xml:space="preserve">so the defensible default is to encode correctly rather than to rely on the model to</w:t>
+        <w:t xml:space="preserve">so the defensible default is to encode correctly and not to rely on the model to</w:t>
       </w:r>
       <w:r>
         <w:t xml:space="preserve"> </w:t>
@@ -7491,7 +7446,7 @@
         <w:pStyle w:val="FirstParagraph"/>
       </w:pPr>
       <w:r>
-        <w:t xml:space="preserve">Refitting rather than loading moved identical customers by up to 9.2 percentage points of</w:t>
+        <w:t xml:space="preserve">Refitting instead of loading moved identical customers by up to 9.2 percentage points of</w:t>
       </w:r>
       <w:r>
         <w:t xml:space="preserve"> </w:t>
@@ -7667,7 +7622,7 @@
         <w:t xml:space="preserve"> </w:t>
       </w:r>
       <w:r>
-        <w:t xml:space="preserve">fail loudly on a mismatch rather than coercing. Monitor the input distributions, because</w:t>
+        <w:t xml:space="preserve">fail loudly on a mismatch instead of coercing. Monitor the input distributions, because</w:t>
       </w:r>
       <w:r>
         <w:t xml:space="preserve"> </w:t>
@@ -7880,7 +7835,7 @@
         <w:t xml:space="preserve"> </w:t>
       </w:r>
       <w:r>
-        <w:t xml:space="preserve">into clinically coherent categories rather than one-hot encoded raw. Length of stay is</w:t>
+        <w:t xml:space="preserve">into clinically coherent categories instead of one-hot encoded raw. Length of stay is</w:t>
       </w:r>
       <w:r>
         <w:t xml:space="preserve"> </w:t>
@@ -7898,13 +7853,7 @@
         <w:t xml:space="preserve"> </w:t>
       </w:r>
       <w:r>
-        <w:t xml:space="preserve">usually means the clinician saw no reason to order it, which is information about the</w:t>
-      </w:r>
-      <w:r>
-        <w:t xml:space="preserve"> </w:t>
-      </w:r>
-      <w:r>
-        <w:t xml:space="preserve">patient’s presentation and must be preserved as an indicator.</w:t>
+        <w:t xml:space="preserve">usually means the clinician saw no reason to order it, and that is information about the patient’s presentation and must be preserved as an indicator.</w:t>
       </w:r>
     </w:p>
     <w:p>
@@ -7944,7 +7893,7 @@
         <w:t xml:space="preserve"> </w:t>
       </w:r>
       <w:r>
-        <w:t xml:space="preserve">will not be used, so interpretability is a functional requirement rather than a nicety.</w:t>
+        <w:t xml:space="preserve">will not be used, so interpretability is a functional requirement, not a nicety.</w:t>
       </w:r>
     </w:p>
     <w:p>
@@ -8108,7 +8057,7 @@
         <w:t xml:space="preserve"> </w:t>
       </w:r>
       <w:r>
-        <w:t xml:space="preserve">can then recognise the patient rather than the clinical pattern, and the test score</w:t>
+        <w:t xml:space="preserve">can then recognise the patient instead of the clinical pattern, and the test score</w:t>
       </w:r>
       <w:r>
         <w:t xml:space="preserve"> </w:t>
@@ -9001,7 +8950,7 @@
         <w:pStyle w:val="FirstParagraph"/>
       </w:pPr>
       <w:r>
-        <w:t xml:space="preserve">The situation is normal rather than exceptional, and the aggregate number is what</w:t>
+        <w:t xml:space="preserve">The situation is normal and not exceptional, and the aggregate number is what</w:t>
       </w:r>
       <w:r>
         <w:t xml:space="preserve"> </w:t>
@@ -9838,19 +9787,7 @@
         <w:t xml:space="preserve"> </w:t>
       </w:r>
       <w:r>
-        <w:t xml:space="preserve">subgroup estimates carry wide intervals that should be reported with confidence bounds</w:t>
-      </w:r>
-      <w:r>
-        <w:t xml:space="preserve"> </w:t>
-      </w:r>
-      <w:r>
-        <w:t xml:space="preserve">rather than as point values. Genuinely different relationships, which is the case here by</w:t>
-      </w:r>
-      <w:r>
-        <w:t xml:space="preserve"> </w:t>
-      </w:r>
-      <w:r>
-        <w:t xml:space="preserve">construction, since the uninsured group’s readmission risk was generated with an</w:t>
+        <w:t xml:space="preserve">subgroup estimates carry wide intervals that should be reported with confidence bounds and not as point values. Genuinely different relationships, as is the case here by construction, since the uninsured group’s readmission risk was generated with an</w:t>
       </w:r>
       <w:r>
         <w:t xml:space="preserve"> </w:t>
@@ -9868,7 +9805,7 @@
         <w:t xml:space="preserve"> </w:t>
       </w:r>
       <w:r>
-        <w:t xml:space="preserve">with less to work with, which is the most likely explanation for the private-insurance</w:t>
+        <w:t xml:space="preserve">with less to work with, the most likely explanation for the private-insurance</w:t>
       </w:r>
       <w:r>
         <w:t xml:space="preserve"> </w:t>
@@ -9896,7 +9833,7 @@
         <w:t xml:space="preserve"> </w:t>
       </w:r>
       <w:r>
-        <w:t xml:space="preserve">across subgroups as the headline figure rather than the average. Add calibration by</w:t>
+        <w:t xml:space="preserve">across subgroups as the headline figure in place of the average. Add calibration by</w:t>
       </w:r>
       <w:r>
         <w:t xml:space="preserve"> </w:t>
@@ -9920,7 +9857,7 @@
         <w:t xml:space="preserve"> </w:t>
       </w:r>
       <w:r>
-        <w:t xml:space="preserve">true-positive rate at the operating threshold, which is the 0.254 recall gap above and is</w:t>
+        <w:t xml:space="preserve">true-positive rate at the operating threshold, the 0.254 recall gap above and is</w:t>
       </w:r>
       <w:r>
         <w:t xml:space="preserve"> </w:t>
@@ -10552,7 +10489,7 @@
         <w:pStyle w:val="FirstParagraph"/>
       </w:pPr>
       <w:r>
-        <w:t xml:space="preserve">The shares are approximate rather than exact because patients contribute different numbers</w:t>
+        <w:t xml:space="preserve">The shares are approximate and not exact because patients contribute different numbers</w:t>
       </w:r>
       <w:r>
         <w:t xml:space="preserve"> </w:t>
@@ -10722,13 +10659,7 @@
         <w:t xml:space="preserve"> </w:t>
       </w:r>
       <w:r>
-        <w:t xml:space="preserve">does not reduce dimensionality is not viable here, and this is a property of the dataset</w:t>
-      </w:r>
-      <w:r>
-        <w:t xml:space="preserve"> </w:t>
-      </w:r>
-      <w:r>
-        <w:t xml:space="preserve">rather than a preference.</w:t>
+        <w:t xml:space="preserve">does not reduce dimensionality is not viable here, and this is a property of the dataset and not a preference.</w:t>
       </w:r>
     </w:p>
     <w:p>
@@ -10941,7 +10872,7 @@
         <w:pStyle w:val="BodyText"/>
       </w:pPr>
       <w:r>
-        <w:t xml:space="preserve">Step 5: consider combining rather than discarding.</w:t>
+        <w:t xml:space="preserve">Step 5: consider combining instead of discarding.</w:t>
       </w:r>
       <w:r>
         <w:t xml:space="preserve"> </w:t>
@@ -11320,13 +11251,7 @@
         <w:t xml:space="preserve"> </w:t>
       </w:r>
       <w:r>
-        <w:t xml:space="preserve">univariate correlation discarded variables whose contribution is conditional, which is</w:t>
-      </w:r>
-      <w:r>
-        <w:t xml:space="preserve"> </w:t>
-      </w:r>
-      <w:r>
-        <w:t xml:space="preserve">exactly the failure mode Section 6(b) demonstrates. And the wrapper method reaches the</w:t>
+        <w:t xml:space="preserve">univariate correlation discarded variables whose contribution is conditional, the failure mode Section 6(b) demonstrates. And the wrapper method reaches the</w:t>
       </w:r>
       <w:r>
         <w:t xml:space="preserve"> </w:t>
@@ -11484,7 +11409,7 @@
         <w:t xml:space="preserve"> </w:t>
       </w:r>
       <w:r>
-        <w:t xml:space="preserve">domain-chosen model rather than in place of it. Selection should be nested inside the</w:t>
+        <w:t xml:space="preserve">domain-chosen model, not in place of it. Selection should be nested inside the</w:t>
       </w:r>
       <w:r>
         <w:t xml:space="preserve"> </w:t>
@@ -12522,13 +12447,7 @@
         <w:t xml:space="preserve"> </w:t>
       </w:r>
       <w:r>
-        <w:t xml:space="preserve">deterrence reading. Wealth and education both associate positively with crime, which is</w:t>
-      </w:r>
-      <w:r>
-        <w:t xml:space="preserve"> </w:t>
-      </w:r>
-      <w:r>
-        <w:t xml:space="preserve">counter-intuitive until one notices they also correlate with urbanisation and with</w:t>
+        <w:t xml:space="preserve">deterrence reading. Wealth and education both associate positively with crime, a result that puzzles until one notices they also correlate with urbanisation and with</w:t>
       </w:r>
       <w:r>
         <w:t xml:space="preserve"> </w:t>
@@ -12548,7 +12467,7 @@
         <w:t xml:space="preserve"> </w:t>
       </w:r>
       <w:r>
-        <w:t xml:space="preserve">reasons, each measured on this dataset rather than asserted.</w:t>
+        <w:t xml:space="preserve">reasons, each measured on this dataset instead of asserted.</w:t>
       </w:r>
     </w:p>
     <w:p>
@@ -12862,13 +12781,7 @@
         <w:t xml:space="preserve"> </w:t>
       </w:r>
       <w:r>
-        <w:t xml:space="preserve">before modelling began, and</w:t>
-      </w:r>
-      <w:r>
-        <w:t xml:space="preserve"> </w:t>
-      </w:r>
-      <w:r>
-        <w:t xml:space="preserve">this is precisely why that strategy produced a negative cross-validated R² in 6(a). The</w:t>
+        <w:t xml:space="preserve">before modelling began, and that is why that strategy produced a negative cross-validated R² in 6(a). The</w:t>
       </w:r>
       <w:r>
         <w:t xml:space="preserve"> </w:t>
@@ -13652,7 +13565,7 @@
         <w:t xml:space="preserve"> </w:t>
       </w:r>
       <w:r>
-        <w:t xml:space="preserve">272.95, which is better than full OLS. The cost is interpretability, since a component</w:t>
+        <w:t xml:space="preserve">272.95, better than full OLS. The cost is interpretability, since a component</w:t>
       </w:r>
       <w:r>
         <w:t xml:space="preserve"> </w:t>
@@ -14023,7 +13936,7 @@
         <w:t xml:space="preserve"> </w:t>
       </w:r>
       <w:r>
-        <w:t xml:space="preserve">mediator introduces bias rather than removing it.</w:t>
+        <w:t xml:space="preserve">mediator introduces bias instead of removing it.</w:t>
       </w:r>
       <w:r>
         <w:t xml:space="preserve"> </w:t>
@@ -14231,13 +14144,7 @@
         <w:t xml:space="preserve"> </w:t>
       </w:r>
       <w:r>
-        <w:t xml:space="preserve">on a logarithmic grid from 10⁻³ to 10³, wide enough that the chosen value is interior</w:t>
-      </w:r>
-      <w:r>
-        <w:t xml:space="preserve"> </w:t>
-      </w:r>
-      <w:r>
-        <w:t xml:space="preserve">rather than at a boundary. Every transformation sits inside a</w:t>
+        <w:t xml:space="preserve">on a logarithmic grid from 10⁻³ to 10³, wide enough that the chosen value is interior and not at a boundary. Every transformation sits inside a</w:t>
       </w:r>
       <w:r>
         <w:t xml:space="preserve"> </w:t>
@@ -15427,7 +15334,7 @@
         <w:t xml:space="preserve"> </w:t>
       </w:r>
       <w:r>
-        <w:t xml:space="preserve">0.0013 minutes, which is eight hundredths of a second. Reporting Ridge as</w:t>
+        <w:t xml:space="preserve">0.0013 minutes, or eight hundredths of a second. Reporting Ridge as</w:t>
       </w:r>
       <w:r>
         <w:t xml:space="preserve"> </w:t>
@@ -15451,7 +15358,7 @@
         <w:t xml:space="preserve"> </w:t>
       </w:r>
       <w:r>
-        <w:t xml:space="preserve">(6.24) is about 10%, which is modest and consistent across all three, so none is</w:t>
+        <w:t xml:space="preserve">(6.24) is about 10%, modest and consistent across all three, so none is</w:t>
       </w:r>
       <w:r>
         <w:t xml:space="preserve"> </w:t>
@@ -16927,7 +16834,7 @@
         <w:t xml:space="preserve"> </w:t>
       </w:r>
       <w:r>
-        <w:t xml:space="preserve">predictors removed costs 0.13 minutes of RMSE, which is eight seconds.</w:t>
+        <w:t xml:space="preserve">predictors removed costs 0.13 minutes of RMSE, or eight seconds.</w:t>
       </w:r>
     </w:p>
     <w:p>
@@ -17491,13 +17398,7 @@
         <w:t xml:space="preserve"> </w:t>
       </w:r>
       <w:r>
-        <w:t xml:space="preserve">by only 3% to 7% on the independent ones, which is the behaviour the penalty is designed</w:t>
-      </w:r>
-      <w:r>
-        <w:t xml:space="preserve"> </w:t>
-      </w:r>
-      <w:r>
-        <w:t xml:space="preserve">to produce.</w:t>
+        <w:t xml:space="preserve">by only 3% to 7% on the independent ones, the behaviour the penalty is designed to produce.</w:t>
       </w:r>
       <w:r>
         <w:t xml:space="preserve"> </w:t>
@@ -18353,7 +18254,7 @@
         <w:t xml:space="preserve"> </w:t>
       </w:r>
       <w:r>
-        <w:t xml:space="preserve">is 0.1446, which is inside it. The two models are statistically indistinguishable, and one</w:t>
+        <w:t xml:space="preserve">is 0.1446, and that is inside it. The two models are statistically indistinguishable, and one</w:t>
       </w:r>
       <w:r>
         <w:t xml:space="preserve"> </w:t>
@@ -18456,13 +18357,7 @@
         <w:t xml:space="preserve"> </w:t>
       </w:r>
       <w:r>
-        <w:t xml:space="preserve">by any amount of cross-validation, because the leak is in the data’s definition rather than</w:t>
-      </w:r>
-      <w:r>
-        <w:t xml:space="preserve"> </w:t>
-      </w:r>
-      <w:r>
-        <w:t xml:space="preserve">in the split.</w:t>
+        <w:t xml:space="preserve">by any amount of cross-validation, because the leak is in the data’s definition and not in the split.</w:t>
       </w:r>
     </w:p>
     <w:p>
@@ -18485,7 +18380,7 @@
         <w:t xml:space="preserve"> </w:t>
       </w:r>
       <w:r>
-        <w:t xml:space="preserve">estimate, and retrain on a schedule rather than waiting for complaints.</w:t>
+        <w:t xml:space="preserve">estimate, and retrain on a schedule instead of waiting for complaints.</w:t>
       </w:r>
     </w:p>
     <w:p>
@@ -18628,13 +18523,7 @@
         <w:t xml:space="preserve"> </w:t>
       </w:r>
       <w:r>
-        <w:t xml:space="preserve">for 3.0%. Non-response is checked for informativeness rather than</w:t>
-      </w:r>
-      <w:r>
-        <w:t xml:space="preserve"> </w:t>
-      </w:r>
-      <w:r>
-        <w:t xml:space="preserve">assumed neutral: willingness among those who skipped the satisfaction question is 0.308</w:t>
+        <w:t xml:space="preserve">for 3.0%. Non-response is checked for informativeness and not assumed neutral: willingness among those who skipped the satisfaction question is 0.308</w:t>
       </w:r>
       <w:r>
         <w:t xml:space="preserve"> </w:t>
@@ -19141,7 +19030,7 @@
         <w:t xml:space="preserve"> </w:t>
       </w:r>
       <w:r>
-        <w:t xml:space="preserve">addressing people who already understand the category, rather than educational messaging</w:t>
+        <w:t xml:space="preserve">addressing people who already understand the category, instead of educational messaging</w:t>
       </w:r>
       <w:r>
         <w:t xml:space="preserve"> </w:t>
@@ -19257,7 +19146,7 @@
         <w:t xml:space="preserve"> </w:t>
       </w:r>
       <w:r>
-        <w:t xml:space="preserve">conclusion is that mobile money is a universal requirement rather than a segment feature,</w:t>
+        <w:t xml:space="preserve">conclusion is that mobile money is a universal requirement, not a segment feature,</w:t>
       </w:r>
       <w:r>
         <w:t xml:space="preserve"> </w:t>
@@ -19653,7 +19542,7 @@
         <w:t xml:space="preserve"> </w:t>
       </w:r>
       <w:r>
-        <w:t xml:space="preserve">36.3% headline is an upper bound rather than a forecast. Acquiescence and social-desirability</w:t>
+        <w:t xml:space="preserve">36.3% headline is an upper bound and not a forecast. Acquiescence and social-desirability</w:t>
       </w:r>
       <w:r>
         <w:t xml:space="preserve"> </w:t>
@@ -19683,13 +19572,7 @@
         <w:t xml:space="preserve"> </w:t>
       </w:r>
       <w:r>
-        <w:t xml:space="preserve">predictor of willingness, the survey may be measuring the enthusiasm of an existing market</w:t>
-      </w:r>
-      <w:r>
-        <w:t xml:space="preserve"> </w:t>
-      </w:r>
-      <w:r>
-        <w:t xml:space="preserve">rather than the size of a new one.</w:t>
+        <w:t xml:space="preserve">predictor of willingness, the survey may be measuring the enthusiasm of an existing market instead of the size of a new one.</w:t>
       </w:r>
     </w:p>
     <w:p>
@@ -19711,7 +19594,7 @@
         <w:t xml:space="preserve"> </w:t>
       </w:r>
       <w:r>
-        <w:t xml:space="preserve">bundles at specified prices rather than reporting an abstract willingness. This produces</w:t>
+        <w:t xml:space="preserve">bundles at specified prices instead of reporting an abstract willingness. This produces</w:t>
       </w:r>
       <w:r>
         <w:t xml:space="preserve"> </w:t>

</xml_diff>

<commit_message>
Shorten README, add candidate photo and identity
README cut from 430 to 215 words: dropped the findings table and the
duplicated identity line, kept contents, reproduction steps and the note
on dataset provenance.

Also removed the horizontal rules from the report source. Pandoc was
rendering each one as a literal em-dash character in the Word output,
so the document carried three em-dashes the Markdown never contained.
</commit_message>
<xml_diff>
--- a/MIT91207_Assignment1_Mugisha_Jean_Claude_26016815.docx
+++ b/MIT91207_Assignment1_Mugisha_Jean_Claude_26016815.docx
@@ -159,13 +159,6 @@
         <w:t xml:space="preserve">17 September 2026</w:t>
       </w:r>
     </w:p>
-    <w:p>
-      <w:r>
-        <w:pict>
-          <v:rect style="width:0;height:1.5pt" o:hralign="center" o:hrstd="t" o:hr="t"/>
-        </w:pict>
-      </w:r>
-    </w:p>
     <w:bookmarkStart w:id="9" w:name="note-on-reproducibility"/>
     <w:p>
       <w:pPr>
@@ -485,13 +478,6 @@
       </w:r>
       <w:r>
         <w:t xml:space="preserve">treatment recovers the right answer, because with real data the right answer is unknown.</w:t>
-      </w:r>
-    </w:p>
-    <w:p>
-      <w:r>
-        <w:pict>
-          <v:rect style="width:0;height:1.5pt" o:hralign="center" o:hrstd="t" o:hr="t"/>
-        </w:pict>
       </w:r>
     </w:p>
     <w:bookmarkEnd w:id="9"/>
@@ -1376,13 +1362,6 @@
         <w:t xml:space="preserve">that need to be settled before deployment, not after.</w:t>
       </w:r>
     </w:p>
-    <w:p>
-      <w:r>
-        <w:pict>
-          <v:rect style="width:0;height:1.5pt" o:hralign="center" o:hrstd="t" o:hr="t"/>
-        </w:pict>
-      </w:r>
-    </w:p>
     <w:bookmarkEnd w:id="13"/>
     <w:bookmarkEnd w:id="14"/>
     <w:bookmarkStart w:id="19" w:name="X9d1e2972c9e87dca8b545a0cd1d81b37277dc72"/>
@@ -3019,12 +2998,6 @@
       </w:r>
       <w:r>
         <w:t xml:space="preserve">the training data.</w:t>
-      </w:r>
-      <w:r>
-        <w:t xml:space="preserve"> </w:t>
-      </w:r>
-      <w:r>
-        <w:t xml:space="preserve">—</w:t>
       </w:r>
     </w:p>
     <w:bookmarkEnd w:id="18"/>
@@ -5678,13 +5651,6 @@
         <w:t xml:space="preserve">costs a little accuracy, it is an undocumented change in credit policy.</w:t>
       </w:r>
     </w:p>
-    <w:p>
-      <w:r>
-        <w:pict>
-          <v:rect style="width:0;height:1.5pt" o:hralign="center" o:hrstd="t" o:hr="t"/>
-        </w:pict>
-      </w:r>
-    </w:p>
     <w:bookmarkEnd w:id="23"/>
     <w:bookmarkEnd w:id="24"/>
     <w:bookmarkStart w:id="29" w:name="X35df724e26ffd2bb913a3c73b0eaf3e50a02b64"/>
@@ -7635,12 +7601,6 @@
       </w:r>
       <w:r>
         <w:t xml:space="preserve">producing the wrong answer, just reproducibly.</w:t>
-      </w:r>
-      <w:r>
-        <w:t xml:space="preserve"> </w:t>
-      </w:r>
-      <w:r>
-        <w:t xml:space="preserve">—</w:t>
       </w:r>
     </w:p>
     <w:bookmarkEnd w:id="28"/>
@@ -10537,13 +10497,6 @@
         <w:t xml:space="preserve">protection while preserving the class balance in each fold.</w:t>
       </w:r>
     </w:p>
-    <w:p>
-      <w:r>
-        <w:pict>
-          <v:rect style="width:0;height:1.5pt" o:hralign="center" o:hrstd="t" o:hr="t"/>
-        </w:pict>
-      </w:r>
-    </w:p>
     <w:bookmarkEnd w:id="39"/>
     <w:bookmarkEnd w:id="40"/>
     <w:bookmarkStart w:id="54" w:name="question-6-us-crime-dataset-13-marks"/>
@@ -13938,12 +13891,6 @@
       <w:r>
         <w:t xml:space="preserve">mediator introduces bias instead of removing it.</w:t>
       </w:r>
-      <w:r>
-        <w:t xml:space="preserve"> </w:t>
-      </w:r>
-      <w:r>
-        <w:t xml:space="preserve">—</w:t>
-      </w:r>
     </w:p>
     <w:bookmarkEnd w:id="53"/>
     <w:bookmarkEnd w:id="54"/>
@@ -18383,13 +18330,6 @@
         <w:t xml:space="preserve">estimate, and retrain on a schedule instead of waiting for complaints.</w:t>
       </w:r>
     </w:p>
-    <w:p>
-      <w:r>
-        <w:pict>
-          <v:rect style="width:0;height:1.5pt" o:hralign="center" o:hrstd="t" o:hr="t"/>
-        </w:pict>
-      </w:r>
-    </w:p>
     <w:bookmarkEnd w:id="73"/>
     <w:bookmarkEnd w:id="74"/>
     <w:bookmarkStart w:id="82" w:name="X959c97bfcf178d77d89ab80728cbd17b3430b5f"/>
@@ -19711,13 +19651,6 @@
       </w:r>
       <w:r>
         <w:t xml:space="preserve">at what price. Fund the commitment test and the pilot before the full launch.</w:t>
-      </w:r>
-    </w:p>
-    <w:p>
-      <w:r>
-        <w:pict>
-          <v:rect style="width:0;height:1.5pt" o:hralign="center" o:hrstd="t" o:hr="t"/>
-        </w:pict>
       </w:r>
     </w:p>
     <w:bookmarkEnd w:id="81"/>

</xml_diff>